<commit_message>
Refresh the presentation-content document for the new sections
Re-extracted from the 31-beat deck so the Word version carries the three new
main-flow sections and the coverage map, with the chart map and the special
beat indices updated for the shift. Also stops the two recommendation section
labels printing twice.

18 pages, ~3,900 words.

Co-Authored-By: Claude Opus 5 <noreply@anthropic.com>
</commit_message>
<xml_diff>
--- a/Group8_EPP_Presentation_Content.docx
+++ b/Group8_EPP_Presentation_Content.docx
@@ -1726,6 +1726,169 @@
           <w:sz w:val="15"/>
           <w:szCs w:val="15"/>
         </w:rPr>
+        <w:t xml:space="preserve">PART 3 · THE CURRENT SITUATION</w:t>
+      </w:r>
+    </w:p>
+    <w:p>
+      <w:pPr>
+        <w:pStyle w:val="Heading2"/>
+        <w:keepNext/>
+        <w:keepLines/>
+        <w:spacing w:after="140" w:before="40"/>
+      </w:pPr>
+      <w:r>
+        <w:rPr>
+          <w:rFonts w:ascii="Calibri" w:cs="Calibri" w:eastAsia="Calibri" w:hAnsi="Calibri"/>
+          <w:b/>
+          <w:bCs/>
+          <w:color w:val="00471B"/>
+          <w:sz w:val="27"/>
+          <w:szCs w:val="27"/>
+        </w:rPr>
+        <w:t xml:space="preserve">The policy exists. Its use on a stadium is not on the public record.</w:t>
+      </w:r>
+    </w:p>
+    <w:p>
+      <w:pPr>
+        <w:spacing w:after="70" w:before="0"/>
+        <w:ind w:left="260"/>
+      </w:pPr>
+      <w:r>
+        <w:rPr>
+          <w:rFonts w:ascii="Calibri" w:cs="Calibri" w:eastAsia="Calibri" w:hAnsi="Calibri"/>
+          <w:b/>
+          <w:bCs/>
+          <w:color w:val="1C1F26"/>
+          <w:sz w:val="21"/>
+          <w:szCs w:val="21"/>
+        </w:rPr>
+        <w:t xml:space="preserve">The policy — Published: </w:t>
+      </w:r>
+      <w:r>
+        <w:rPr>
+          <w:rFonts w:ascii="Calibri" w:cs="Calibri" w:eastAsia="Calibri" w:hAnsi="Calibri"/>
+          <w:color w:val="1C1F26"/>
+          <w:sz w:val="21"/>
+          <w:szCs w:val="21"/>
+        </w:rPr>
+        <w:t xml:space="preserve">A SAR 100m imported-value gate and a 35% obligation, with seven credit categories [R09].</w:t>
+      </w:r>
+    </w:p>
+    <w:p>
+      <w:pPr>
+        <w:spacing w:after="70" w:before="0"/>
+        <w:ind w:left="260"/>
+      </w:pPr>
+      <w:r>
+        <w:rPr>
+          <w:rFonts w:ascii="Calibri" w:cs="Calibri" w:eastAsia="Calibri" w:hAnsi="Calibri"/>
+          <w:b/>
+          <w:bCs/>
+          <w:color w:val="1C1F26"/>
+          <w:sz w:val="21"/>
+          <w:szCs w:val="21"/>
+        </w:rPr>
+        <w:t xml:space="preserve">This sector — No evidence found: </w:t>
+      </w:r>
+      <w:r>
+        <w:rPr>
+          <w:rFonts w:ascii="Calibri" w:cs="Calibri" w:eastAsia="Calibri" w:hAnsi="Calibri"/>
+          <w:color w:val="1C1F26"/>
+          <w:sz w:val="21"/>
+          <w:szCs w:val="21"/>
+        </w:rPr>
+        <w:t xml:space="preserve">No EP agreement, credit factor or imported-value figure is published for any Saudi stadium.</w:t>
+      </w:r>
+    </w:p>
+    <w:p>
+      <w:pPr>
+        <w:spacing w:after="70" w:before="0"/>
+        <w:ind w:left="260"/>
+      </w:pPr>
+      <w:r>
+        <w:rPr>
+          <w:rFonts w:ascii="Calibri" w:cs="Calibri" w:eastAsia="Calibri" w:hAnsi="Calibri"/>
+          <w:b/>
+          <w:bCs/>
+          <w:color w:val="1C1F26"/>
+          <w:sz w:val="21"/>
+          <w:szCs w:val="21"/>
+        </w:rPr>
+        <w:t xml:space="preserve">The project — Notices only: </w:t>
+      </w:r>
+      <w:r>
+        <w:rPr>
+          <w:rFonts w:ascii="Calibri" w:cs="Calibri" w:eastAsia="Calibri" w:hAnsi="Calibri"/>
+          <w:color w:val="1C1F26"/>
+          <w:sz w:val="21"/>
+          <w:szCs w:val="21"/>
+        </w:rPr>
+        <w:t xml:space="preserve">Main works invited 25 November 2025, preliminary works 7 April 2026 [R02][R03].</w:t>
+      </w:r>
+    </w:p>
+    <w:p>
+      <w:pPr>
+        <w:spacing w:after="60" w:before="0"/>
+      </w:pPr>
+      <w:r>
+        <w:rPr>
+          <w:rFonts w:ascii="Calibri" w:cs="Calibri" w:eastAsia="Calibri" w:hAnsi="Calibri"/>
+          <w:color w:val="1C1F26"/>
+          <w:sz w:val="8"/>
+          <w:szCs w:val="8"/>
+        </w:rPr>
+        <w:t xml:space="preserve"/>
+      </w:r>
+    </w:p>
+    <w:p>
+      <w:pPr>
+        <w:spacing w:after="110" w:before="0"/>
+      </w:pPr>
+      <w:r>
+        <w:rPr>
+          <w:rFonts w:ascii="Calibri" w:cs="Calibri" w:eastAsia="Calibri" w:hAnsi="Calibri"/>
+          <w:color w:val="1C1F26"/>
+          <w:sz w:val="21"/>
+          <w:szCs w:val="21"/>
+        </w:rPr>
+        <w:t xml:space="preserve">Where the dependence sits. In the equipment — basic metals and electrical machinery are 54.5% and 50.3% imported as a share of national supply [R05] — and in the people who commission it. Testing, controls set-up and fault diagnosis are routinely flown in.</w:t>
+      </w:r>
+    </w:p>
+    <w:p>
+      <w:pPr>
+        <w:pBdr>
+          <w:top w:val="single" w:color="D7DBE0" w:sz="4" w:space="6"/>
+        </w:pBdr>
+        <w:spacing w:after="200" w:before="60"/>
+      </w:pPr>
+      <w:r>
+        <w:rPr>
+          <w:rFonts w:ascii="Calibri" w:cs="Calibri" w:eastAsia="Calibri" w:hAnsi="Calibri"/>
+          <w:i/>
+          <w:iCs/>
+          <w:color w:val="5B6472"/>
+          <w:sz w:val="16"/>
+          <w:szCs w:val="16"/>
+        </w:rPr>
+        <w:t xml:space="preserve">Searched 13–22 October 2026: LCGPA's training material and portal [R09], the April 2026 consultation notice [R11], Ministry of Sport notices and the main-contractor questionnaire [R02][R03], FIFA's bid evaluation [R01]. Absence from the public record is not proof that no agreement exists — it is the limit of what we could verify.</w:t>
+      </w:r>
+    </w:p>
+    <w:p>
+      <w:pPr>
+        <w:keepNext/>
+        <w:keepLines/>
+        <w:spacing w:after="40" w:before="260"/>
+      </w:pPr>
+      <w:r>
+        <w:rPr>
+          <w:rFonts w:ascii="Calibri" w:cs="Calibri" w:eastAsia="Calibri" w:hAnsi="Calibri"/>
+          <w:b/>
+          <w:bCs/>
+          <w:color w:val="8A6D1F"/>
+          <w:spacing w:val="24"/>
+          <w:sz w:val="15"/>
+          <w:szCs w:val="15"/>
+        </w:rPr>
         <w:t xml:space="preserve">PART 3 · THE EPP AND LOCALISATION IN OUR SECTOR</w:t>
       </w:r>
     </w:p>
@@ -2705,6 +2868,169 @@
     </w:p>
     <w:p>
       <w:pPr>
+        <w:keepNext/>
+        <w:keepLines/>
+        <w:spacing w:after="40" w:before="260"/>
+      </w:pPr>
+      <w:r>
+        <w:rPr>
+          <w:rFonts w:ascii="Calibri" w:cs="Calibri" w:eastAsia="Calibri" w:hAnsi="Calibri"/>
+          <w:b/>
+          <w:bCs/>
+          <w:color w:val="8A6D1F"/>
+          <w:spacing w:val="24"/>
+          <w:sz w:val="15"/>
+          <w:szCs w:val="15"/>
+        </w:rPr>
+        <w:t xml:space="preserve">PART 3 · CHALLENGES AND RISKS</w:t>
+      </w:r>
+    </w:p>
+    <w:p>
+      <w:pPr>
+        <w:pStyle w:val="Heading2"/>
+        <w:keepNext/>
+        <w:keepLines/>
+        <w:spacing w:after="140" w:before="40"/>
+      </w:pPr>
+      <w:r>
+        <w:rPr>
+          <w:rFonts w:ascii="Calibri" w:cs="Calibri" w:eastAsia="Calibri" w:hAnsi="Calibri"/>
+          <w:b/>
+          <w:bCs/>
+          <w:color w:val="00471B"/>
+          <w:sz w:val="27"/>
+          <w:szCs w:val="27"/>
+        </w:rPr>
+        <w:t xml:space="preserve">Six ways this fails — and the three that would decide it</w:t>
+      </w:r>
+    </w:p>
+    <w:p>
+      <w:pPr>
+        <w:spacing w:after="70" w:before="0"/>
+        <w:ind w:left="260"/>
+      </w:pPr>
+      <w:r>
+        <w:rPr>
+          <w:rFonts w:ascii="Calibri" w:cs="Calibri" w:eastAsia="Calibri" w:hAnsi="Calibri"/>
+          <w:b/>
+          <w:bCs/>
+          <w:color w:val="1C1F26"/>
+          <w:sz w:val="21"/>
+          <w:szCs w:val="21"/>
+        </w:rPr>
+        <w:t xml:space="preserve">Critical — The deadline: </w:t>
+      </w:r>
+      <w:r>
+        <w:rPr>
+          <w:rFonts w:ascii="Calibri" w:cs="Calibri" w:eastAsia="Calibri" w:hAnsi="Calibri"/>
+          <w:color w:val="1C1F26"/>
+          <w:sz w:val="21"/>
+          <w:szCs w:val="21"/>
+        </w:rPr>
+        <w:t xml:space="preserve">An unready supplier can delay safe delivery of a 2034 venue. Train early; release critical work only after independent qualification.</w:t>
+      </w:r>
+    </w:p>
+    <w:p>
+      <w:pPr>
+        <w:spacing w:after="70" w:before="0"/>
+        <w:ind w:left="260"/>
+      </w:pPr>
+      <w:r>
+        <w:rPr>
+          <w:rFonts w:ascii="Calibri" w:cs="Calibri" w:eastAsia="Calibri" w:hAnsi="Calibri"/>
+          <w:b/>
+          <w:bCs/>
+          <w:color w:val="1C1F26"/>
+          <w:sz w:val="21"/>
+          <w:szCs w:val="21"/>
+        </w:rPr>
+        <w:t xml:space="preserve">Serious — Tools and rights: </w:t>
+      </w:r>
+      <w:r>
+        <w:rPr>
+          <w:rFonts w:ascii="Calibri" w:cs="Calibri" w:eastAsia="Calibri" w:hAnsi="Calibri"/>
+          <w:color w:val="1C1F26"/>
+          <w:sz w:val="21"/>
+          <w:szCs w:val="21"/>
+        </w:rPr>
+        <w:t xml:space="preserve">Training cannot replace foreign expertise without the means of doing the work. Put software, manuals, diagnostic tools and licences inside the EP agreement.</w:t>
+      </w:r>
+    </w:p>
+    <w:p>
+      <w:pPr>
+        <w:spacing w:after="70" w:before="0"/>
+        <w:ind w:left="260"/>
+      </w:pPr>
+      <w:r>
+        <w:rPr>
+          <w:rFonts w:ascii="Calibri" w:cs="Calibri" w:eastAsia="Calibri" w:hAnsi="Calibri"/>
+          <w:b/>
+          <w:bCs/>
+          <w:color w:val="1C1F26"/>
+          <w:sz w:val="21"/>
+          <w:szCs w:val="21"/>
+        </w:rPr>
+        <w:t xml:space="preserve">Serious — Demand after 2034: </w:t>
+      </w:r>
+      <w:r>
+        <w:rPr>
+          <w:rFonts w:ascii="Calibri" w:cs="Calibri" w:eastAsia="Calibri" w:hAnsi="Calibri"/>
+          <w:color w:val="1C1F26"/>
+          <w:sz w:val="21"/>
+          <w:szCs w:val="21"/>
+        </w:rPr>
+        <w:t xml:space="preserve">Skills disappear when one project ends. Choose transferable building skills and secure a second customer before handover.</w:t>
+      </w:r>
+    </w:p>
+    <w:p>
+      <w:pPr>
+        <w:spacing w:after="60" w:before="0"/>
+      </w:pPr>
+      <w:r>
+        <w:rPr>
+          <w:rFonts w:ascii="Calibri" w:cs="Calibri" w:eastAsia="Calibri" w:hAnsi="Calibri"/>
+          <w:color w:val="1C1F26"/>
+          <w:sz w:val="8"/>
+          <w:szCs w:val="8"/>
+        </w:rPr>
+        <w:t xml:space="preserve"/>
+      </w:r>
+    </w:p>
+    <w:p>
+      <w:pPr>
+        <w:spacing w:after="110" w:before="0"/>
+      </w:pPr>
+      <w:r>
+        <w:rPr>
+          <w:rFonts w:ascii="Calibri" w:cs="Calibri" w:eastAsia="Calibri" w:hAnsi="Calibri"/>
+          <w:color w:val="1C1F26"/>
+          <w:sz w:val="21"/>
+          <w:szCs w:val="21"/>
+        </w:rPr>
+        <w:t xml:space="preserve">Three more we would watch: cost and quality against the equipment's life, routine work counted as new, and imports hidden inside local invoices. All six sit in the appendix with the safeguard we would write into the contract.</w:t>
+      </w:r>
+    </w:p>
+    <w:p>
+      <w:pPr>
+        <w:pBdr>
+          <w:top w:val="single" w:color="D7DBE0" w:sz="4" w:space="6"/>
+        </w:pBdr>
+        <w:spacing w:after="200" w:before="60"/>
+      </w:pPr>
+      <w:r>
+        <w:rPr>
+          <w:rFonts w:ascii="Calibri" w:cs="Calibri" w:eastAsia="Calibri" w:hAnsi="Calibri"/>
+          <w:i/>
+          <w:iCs/>
+          <w:color w:val="5B6472"/>
+          <w:sz w:val="16"/>
+          <w:szCs w:val="16"/>
+        </w:rPr>
+        <w:t xml:space="preserve">Group risk assessment. The safeguards are our proposals, not existing LCGPA requirements.</w:t>
+      </w:r>
+    </w:p>
+    <w:p>
+      <w:pPr>
         <w:pStyle w:val="Heading1"/>
         <w:pageBreakBefore/>
         <w:spacing w:after="180" w:before="0"/>
@@ -2904,6 +3230,143 @@
           <w:szCs w:val="16"/>
         </w:rPr>
         <w:t xml:space="preserve">group proposal.</w:t>
+      </w:r>
+    </w:p>
+    <w:p>
+      <w:pPr>
+        <w:keepNext/>
+        <w:keepLines/>
+        <w:spacing w:after="40" w:before="260"/>
+      </w:pPr>
+      <w:r>
+        <w:rPr>
+          <w:rFonts w:ascii="Calibri" w:cs="Calibri" w:eastAsia="Calibri" w:hAnsi="Calibri"/>
+          <w:b/>
+          <w:bCs/>
+          <w:color w:val="8A6D1F"/>
+          <w:spacing w:val="24"/>
+          <w:sz w:val="15"/>
+          <w:szCs w:val="15"/>
+        </w:rPr>
+        <w:t xml:space="preserve">PART 4 · EXPECTED BENEFITS</w:t>
+      </w:r>
+    </w:p>
+    <w:p>
+      <w:pPr>
+        <w:pStyle w:val="Heading2"/>
+        <w:keepNext/>
+        <w:keepLines/>
+        <w:spacing w:after="140" w:before="40"/>
+      </w:pPr>
+      <w:r>
+        <w:rPr>
+          <w:rFonts w:ascii="Calibri" w:cs="Calibri" w:eastAsia="Calibri" w:hAnsi="Calibri"/>
+          <w:b/>
+          <w:bCs/>
+          <w:color w:val="00471B"/>
+          <w:sz w:val="27"/>
+          <w:szCs w:val="27"/>
+        </w:rPr>
+        <w:t xml:space="preserve">What this is worth — now, and after 2034</w:t>
+      </w:r>
+    </w:p>
+    <w:p>
+      <w:pPr>
+        <w:spacing w:after="70" w:before="0"/>
+        <w:ind w:left="260"/>
+      </w:pPr>
+      <w:r>
+        <w:rPr>
+          <w:rFonts w:ascii="Calibri" w:cs="Calibri" w:eastAsia="Calibri" w:hAnsi="Calibri"/>
+          <w:b/>
+          <w:bCs/>
+          <w:color w:val="1C1F26"/>
+          <w:sz w:val="21"/>
+          <w:szCs w:val="21"/>
+        </w:rPr>
+        <w:t xml:space="preserve">While it is built — A bigger first round: </w:t>
+      </w:r>
+      <w:r>
+        <w:rPr>
+          <w:rFonts w:ascii="Calibri" w:cs="Calibri" w:eastAsia="Calibri" w:hAnsi="Calibri"/>
+          <w:color w:val="1C1F26"/>
+          <w:sz w:val="21"/>
+          <w:szCs w:val="21"/>
+        </w:rPr>
+        <w:t xml:space="preserve">Work done here instead of imported lifts the local share of the first round — the lever Part 2 values at +SAR 190m per SAR 1bn for ten percentage points. Saudi teams are on live commissioning work rather than watching it.</w:t>
+      </w:r>
+    </w:p>
+    <w:p>
+      <w:pPr>
+        <w:spacing w:after="70" w:before="0"/>
+        <w:ind w:left="260"/>
+      </w:pPr>
+      <w:r>
+        <w:rPr>
+          <w:rFonts w:ascii="Calibri" w:cs="Calibri" w:eastAsia="Calibri" w:hAnsi="Calibri"/>
+          <w:b/>
+          <w:bCs/>
+          <w:color w:val="1C1F26"/>
+          <w:sz w:val="21"/>
+          <w:szCs w:val="21"/>
+        </w:rPr>
+        <w:t xml:space="preserve">After handover — Something still standing: </w:t>
+      </w:r>
+      <w:r>
+        <w:rPr>
+          <w:rFonts w:ascii="Calibri" w:cs="Calibri" w:eastAsia="Calibri" w:hAnsi="Calibri"/>
+          <w:color w:val="1C1F26"/>
+          <w:sz w:val="21"/>
+          <w:szCs w:val="21"/>
+        </w:rPr>
+        <w:t xml:space="preserve">People who passed an independent test and are training the next team. Suppliers qualified to serve the next venue. A cost and quality baseline the next tender can price against.</w:t>
+      </w:r>
+    </w:p>
+    <w:p>
+      <w:pPr>
+        <w:spacing w:after="60" w:before="0"/>
+      </w:pPr>
+      <w:r>
+        <w:rPr>
+          <w:rFonts w:ascii="Calibri" w:cs="Calibri" w:eastAsia="Calibri" w:hAnsi="Calibri"/>
+          <w:color w:val="1C1F26"/>
+          <w:sz w:val="8"/>
+          <w:szCs w:val="8"/>
+        </w:rPr>
+        <w:t xml:space="preserve"/>
+      </w:r>
+    </w:p>
+    <w:p>
+      <w:pPr>
+        <w:spacing w:after="110" w:before="0"/>
+      </w:pPr>
+      <w:r>
+        <w:rPr>
+          <w:rFonts w:ascii="Calibri" w:cs="Calibri" w:eastAsia="Calibri" w:hAnsi="Calibri"/>
+          <w:color w:val="1C1F26"/>
+          <w:sz w:val="21"/>
+          <w:szCs w:val="21"/>
+        </w:rPr>
+        <w:t xml:space="preserve">We claim no exact monetary figure. The Part 2 number is an illustration under stated assumptions, not a forecast of this project. What we would commit to is measurement: test pass rates during construction, employment retained at 12 and 24 months, and production net of imported inputs across future projects.</w:t>
+      </w:r>
+    </w:p>
+    <w:p>
+      <w:pPr>
+        <w:pBdr>
+          <w:top w:val="single" w:color="D7DBE0" w:sz="4" w:space="6"/>
+        </w:pBdr>
+        <w:spacing w:after="200" w:before="60"/>
+      </w:pPr>
+      <w:r>
+        <w:rPr>
+          <w:rFonts w:ascii="Calibri" w:cs="Calibri" w:eastAsia="Calibri" w:hAnsi="Calibri"/>
+          <w:i/>
+          <w:iCs/>
+          <w:color w:val="5B6472"/>
+          <w:sz w:val="16"/>
+          <w:szCs w:val="16"/>
+        </w:rPr>
+        <w:t xml:space="preserve">Group proposal. The +SAR 190m figure is the illustrative model from Part 2, not a projected return on this pilot.</w:t>
       </w:r>
     </w:p>
     <w:p>
@@ -4831,38 +5294,6 @@
     </w:p>
     <w:p>
       <w:pPr>
-        <w:spacing w:after="110" w:before="0"/>
-      </w:pPr>
-      <w:r>
-        <w:rPr>
-          <w:rFonts w:ascii="Calibri" w:cs="Calibri" w:eastAsia="Calibri" w:hAnsi="Calibri"/>
-          <w:i/>
-          <w:iCs/>
-          <w:color w:val="5B6472"/>
-          <w:sz w:val="17"/>
-          <w:szCs w:val="17"/>
-        </w:rPr>
-        <w:t xml:space="preserve">To LCGPA</w:t>
-      </w:r>
-    </w:p>
-    <w:p>
-      <w:pPr>
-        <w:spacing w:after="110" w:before="0"/>
-      </w:pPr>
-      <w:r>
-        <w:rPr>
-          <w:rFonts w:ascii="Calibri" w:cs="Calibri" w:eastAsia="Calibri" w:hAnsi="Calibri"/>
-          <w:i/>
-          <w:iCs/>
-          <w:color w:val="5B6472"/>
-          <w:sz w:val="17"/>
-          <w:szCs w:val="17"/>
-        </w:rPr>
-        <w:t xml:space="preserve">To a supplier or contractor</w:t>
-      </w:r>
-    </w:p>
-    <w:p>
-      <w:pPr>
         <w:keepNext/>
         <w:keepLines/>
         <w:spacing w:after="40" w:before="260"/>
@@ -4877,7 +5308,7 @@
           <w:sz w:val="15"/>
           <w:szCs w:val="15"/>
         </w:rPr>
-        <w:t xml:space="preserve">APPENDIX · SOURCES RE-VERIFIED TO 22 OCTOBER 2026</w:t>
+        <w:t xml:space="preserve">APPENDIX · FOR QUESTIONS</w:t>
       </w:r>
     </w:p>
     <w:p>
@@ -4896,7 +5327,267 @@
           <w:sz w:val="27"/>
           <w:szCs w:val="27"/>
         </w:rPr>
-        <w:t xml:space="preserve">Sources and declarations</w:t>
+        <w:t xml:space="preserve">Where each question is answered</w:t>
+      </w:r>
+    </w:p>
+    <w:p>
+      <w:pPr>
+        <w:spacing w:after="70" w:before="0"/>
+        <w:ind w:left="260"/>
+      </w:pPr>
+      <w:r>
+        <w:rPr>
+          <w:rFonts w:ascii="Calibri" w:cs="Calibri" w:eastAsia="Calibri" w:hAnsi="Calibri"/>
+          <w:b/>
+          <w:bCs/>
+          <w:color w:val="1C1F26"/>
+          <w:sz w:val="21"/>
+          <w:szCs w:val="21"/>
+        </w:rPr>
+        <w:t xml:space="preserve">1 · Sector: </w:t>
+      </w:r>
+      <w:r>
+        <w:rPr>
+          <w:rFonts w:ascii="Calibri" w:cs="Calibri" w:eastAsia="Calibri" w:hAnsi="Calibri"/>
+          <w:color w:val="1C1F26"/>
+          <w:sz w:val="21"/>
+          <w:szCs w:val="21"/>
+        </w:rPr>
+        <w:t xml:space="preserve">Part 1. Construction and infrastructure, through one venue: King Salman Stadium, a planned 2034 World Cup site.</w:t>
+      </w:r>
+    </w:p>
+    <w:p>
+      <w:pPr>
+        <w:spacing w:after="70" w:before="0"/>
+        <w:ind w:left="260"/>
+      </w:pPr>
+      <w:r>
+        <w:rPr>
+          <w:rFonts w:ascii="Calibri" w:cs="Calibri" w:eastAsia="Calibri" w:hAnsi="Calibri"/>
+          <w:b/>
+          <w:bCs/>
+          <w:color w:val="1C1F26"/>
+          <w:sz w:val="21"/>
+          <w:szCs w:val="21"/>
+        </w:rPr>
+        <w:t xml:space="preserve">2 · Economic concept: </w:t>
+      </w:r>
+      <w:r>
+        <w:rPr>
+          <w:rFonts w:ascii="Calibri" w:cs="Calibri" w:eastAsia="Calibri" w:hAnsi="Calibri"/>
+          <w:color w:val="1C1F26"/>
+          <w:sz w:val="21"/>
+          <w:szCs w:val="21"/>
+        </w:rPr>
+        <w:t xml:space="preserve">Part 2. The spending multiplier and its leakages, applied with Saudi supply-and-use data and anchored to the IMF's Saudi estimate.</w:t>
+      </w:r>
+    </w:p>
+    <w:p>
+      <w:pPr>
+        <w:spacing w:after="70" w:before="0"/>
+        <w:ind w:left="260"/>
+      </w:pPr>
+      <w:r>
+        <w:rPr>
+          <w:rFonts w:ascii="Calibri" w:cs="Calibri" w:eastAsia="Calibri" w:hAnsi="Calibri"/>
+          <w:b/>
+          <w:bCs/>
+          <w:color w:val="1C1F26"/>
+          <w:sz w:val="21"/>
+          <w:szCs w:val="21"/>
+        </w:rPr>
+        <w:t xml:space="preserve">3 · Current situation: </w:t>
+      </w:r>
+      <w:r>
+        <w:rPr>
+          <w:rFonts w:ascii="Calibri" w:cs="Calibri" w:eastAsia="Calibri" w:hAnsi="Calibri"/>
+          <w:color w:val="1C1F26"/>
+          <w:sz w:val="21"/>
+          <w:szCs w:val="21"/>
+        </w:rPr>
+        <w:t xml:space="preserve">Part 3, opening. The policy is published; no stadium EP agreement is on the public record. Import and foreign-expertise dependence quantified from GASTAT.</w:t>
+      </w:r>
+    </w:p>
+    <w:p>
+      <w:pPr>
+        <w:spacing w:after="70" w:before="0"/>
+        <w:ind w:left="260"/>
+      </w:pPr>
+      <w:r>
+        <w:rPr>
+          <w:rFonts w:ascii="Calibri" w:cs="Calibri" w:eastAsia="Calibri" w:hAnsi="Calibri"/>
+          <w:b/>
+          <w:bCs/>
+          <w:color w:val="1C1F26"/>
+          <w:sz w:val="21"/>
+          <w:szCs w:val="21"/>
+        </w:rPr>
+        <w:t xml:space="preserve">4 · Benchmark: </w:t>
+      </w:r>
+      <w:r>
+        <w:rPr>
+          <w:rFonts w:ascii="Calibri" w:cs="Calibri" w:eastAsia="Calibri" w:hAnsi="Calibri"/>
+          <w:color w:val="1C1F26"/>
+          <w:sz w:val="21"/>
+          <w:szCs w:val="21"/>
+        </w:rPr>
+        <w:t xml:space="preserve">Part 3. London 2012 — what worked, what was under-enforced, and the contracting lesson for Saudi Arabia.</w:t>
+      </w:r>
+    </w:p>
+    <w:p>
+      <w:pPr>
+        <w:spacing w:after="70" w:before="0"/>
+        <w:ind w:left="260"/>
+      </w:pPr>
+      <w:r>
+        <w:rPr>
+          <w:rFonts w:ascii="Calibri" w:cs="Calibri" w:eastAsia="Calibri" w:hAnsi="Calibri"/>
+          <w:b/>
+          <w:bCs/>
+          <w:color w:val="1C1F26"/>
+          <w:sz w:val="21"/>
+          <w:szCs w:val="21"/>
+        </w:rPr>
+        <w:t xml:space="preserve">5 · Challenges: </w:t>
+      </w:r>
+      <w:r>
+        <w:rPr>
+          <w:rFonts w:ascii="Calibri" w:cs="Calibri" w:eastAsia="Calibri" w:hAnsi="Calibri"/>
+          <w:color w:val="1C1F26"/>
+          <w:sz w:val="21"/>
+          <w:szCs w:val="21"/>
+        </w:rPr>
+        <w:t xml:space="preserve">Part 3, closing, with all six risks and safeguards in this appendix. No procurement interviews were used; everything cited is public.</w:t>
+      </w:r>
+    </w:p>
+    <w:p>
+      <w:pPr>
+        <w:spacing w:after="70" w:before="0"/>
+        <w:ind w:left="260"/>
+      </w:pPr>
+      <w:r>
+        <w:rPr>
+          <w:rFonts w:ascii="Calibri" w:cs="Calibri" w:eastAsia="Calibri" w:hAnsi="Calibri"/>
+          <w:b/>
+          <w:bCs/>
+          <w:color w:val="1C1F26"/>
+          <w:sz w:val="21"/>
+          <w:szCs w:val="21"/>
+        </w:rPr>
+        <w:t xml:space="preserve">6 · Innovative proposal: </w:t>
+      </w:r>
+      <w:r>
+        <w:rPr>
+          <w:rFonts w:ascii="Calibri" w:cs="Calibri" w:eastAsia="Calibri" w:hAnsi="Calibri"/>
+          <w:color w:val="1C1F26"/>
+          <w:sz w:val="21"/>
+          <w:szCs w:val="21"/>
+        </w:rPr>
+        <w:t xml:space="preserve">Part 4. An academy where graduates return as instructors — mentoring that compounds instead of ending with the contract.</w:t>
+      </w:r>
+    </w:p>
+    <w:p>
+      <w:pPr>
+        <w:spacing w:after="70" w:before="0"/>
+        <w:ind w:left="260"/>
+      </w:pPr>
+      <w:r>
+        <w:rPr>
+          <w:rFonts w:ascii="Calibri" w:cs="Calibri" w:eastAsia="Calibri" w:hAnsi="Calibri"/>
+          <w:b/>
+          <w:bCs/>
+          <w:color w:val="1C1F26"/>
+          <w:sz w:val="21"/>
+          <w:szCs w:val="21"/>
+        </w:rPr>
+        <w:t xml:space="preserve">7 · Expected benefits: </w:t>
+      </w:r>
+      <w:r>
+        <w:rPr>
+          <w:rFonts w:ascii="Calibri" w:cs="Calibri" w:eastAsia="Calibri" w:hAnsi="Calibri"/>
+          <w:color w:val="1C1F26"/>
+          <w:sz w:val="21"/>
+          <w:szCs w:val="21"/>
+        </w:rPr>
+        <w:t xml:space="preserve">Part 4. Value during construction and after handover, with the measures we would be judged on. No exact monetary figure is claimed.</w:t>
+      </w:r>
+    </w:p>
+    <w:p>
+      <w:pPr>
+        <w:spacing w:after="70" w:before="0"/>
+        <w:ind w:left="260"/>
+      </w:pPr>
+      <w:r>
+        <w:rPr>
+          <w:rFonts w:ascii="Calibri" w:cs="Calibri" w:eastAsia="Calibri" w:hAnsi="Calibri"/>
+          <w:b/>
+          <w:bCs/>
+          <w:color w:val="1C1F26"/>
+          <w:sz w:val="21"/>
+          <w:szCs w:val="21"/>
+        </w:rPr>
+        <w:t xml:space="preserve">Evidence rule: </w:t>
+      </w:r>
+      <w:r>
+        <w:rPr>
+          <w:rFonts w:ascii="Calibri" w:cs="Calibri" w:eastAsia="Calibri" w:hAnsi="Calibri"/>
+          <w:color w:val="1C1F26"/>
+          <w:sz w:val="21"/>
+          <w:szCs w:val="21"/>
+        </w:rPr>
+        <w:t xml:space="preserve">Verified facts, verified calculations, illustrations and group proposals are labelled separately on every slide.</w:t>
+      </w:r>
+    </w:p>
+    <w:p>
+      <w:pPr>
+        <w:spacing w:after="60" w:before="0"/>
+      </w:pPr>
+      <w:r>
+        <w:rPr>
+          <w:rFonts w:ascii="Calibri" w:cs="Calibri" w:eastAsia="Calibri" w:hAnsi="Calibri"/>
+          <w:color w:val="1C1F26"/>
+          <w:sz w:val="8"/>
+          <w:szCs w:val="8"/>
+        </w:rPr>
+        <w:t xml:space="preserve"/>
+      </w:r>
+    </w:p>
+    <w:p>
+      <w:pPr>
+        <w:keepNext/>
+        <w:keepLines/>
+        <w:spacing w:after="40" w:before="260"/>
+      </w:pPr>
+      <w:r>
+        <w:rPr>
+          <w:rFonts w:ascii="Calibri" w:cs="Calibri" w:eastAsia="Calibri" w:hAnsi="Calibri"/>
+          <w:b/>
+          <w:bCs/>
+          <w:color w:val="8A6D1F"/>
+          <w:spacing w:val="24"/>
+          <w:sz w:val="15"/>
+          <w:szCs w:val="15"/>
+        </w:rPr>
+        <w:t xml:space="preserve">APPENDIX · SOURCES RE-VERIFIED TO 22 OCTOBER 2026</w:t>
+      </w:r>
+    </w:p>
+    <w:p>
+      <w:pPr>
+        <w:pStyle w:val="Heading2"/>
+        <w:keepNext/>
+        <w:keepLines/>
+        <w:spacing w:after="140" w:before="40"/>
+      </w:pPr>
+      <w:r>
+        <w:rPr>
+          <w:rFonts w:ascii="Calibri" w:cs="Calibri" w:eastAsia="Calibri" w:hAnsi="Calibri"/>
+          <w:b/>
+          <w:bCs/>
+          <w:color w:val="00471B"/>
+          <w:sz w:val="27"/>
+          <w:szCs w:val="27"/>
+        </w:rPr>
+        <w:t xml:space="preserve">Primary sources</w:t>
       </w:r>
     </w:p>
     <w:p>
@@ -5431,6 +6122,58 @@
           <w:szCs w:val="14"/>
         </w:rPr>
         <w:t xml:space="preserve">https://www.uqn.gov.sa/details?p=24374</w:t>
+      </w:r>
+    </w:p>
+    <w:p>
+      <w:pPr>
+        <w:keepNext/>
+        <w:keepLines/>
+        <w:spacing w:after="40" w:before="260"/>
+      </w:pPr>
+      <w:r>
+        <w:rPr>
+          <w:rFonts w:ascii="Calibri" w:cs="Calibri" w:eastAsia="Calibri" w:hAnsi="Calibri"/>
+          <w:b/>
+          <w:bCs/>
+          <w:color w:val="8A6D1F"/>
+          <w:spacing w:val="24"/>
+          <w:sz w:val="15"/>
+          <w:szCs w:val="15"/>
+        </w:rPr>
+        <w:t xml:space="preserve">APPENDIX · SOURCES RE-VERIFIED TO 22 OCTOBER 2026</w:t>
+      </w:r>
+    </w:p>
+    <w:p>
+      <w:pPr>
+        <w:pStyle w:val="Heading2"/>
+        <w:keepNext/>
+        <w:keepLines/>
+        <w:spacing w:after="140" w:before="40"/>
+      </w:pPr>
+      <w:r>
+        <w:rPr>
+          <w:rFonts w:ascii="Calibri" w:cs="Calibri" w:eastAsia="Calibri" w:hAnsi="Calibri"/>
+          <w:b/>
+          <w:bCs/>
+          <w:color w:val="00471B"/>
+          <w:sz w:val="27"/>
+          <w:szCs w:val="27"/>
+        </w:rPr>
+        <w:t xml:space="preserve">Further sources and declarations</w:t>
+      </w:r>
+    </w:p>
+    <w:p>
+      <w:pPr>
+        <w:spacing w:after="60" w:before="0"/>
+      </w:pPr>
+      <w:r>
+        <w:rPr>
+          <w:rFonts w:ascii="Calibri" w:cs="Calibri" w:eastAsia="Calibri" w:hAnsi="Calibri"/>
+          <w:color w:val="1C1F26"/>
+          <w:sz w:val="8"/>
+          <w:szCs w:val="8"/>
+        </w:rPr>
+        <w:t xml:space="preserve"/>
       </w:r>
     </w:p>
     <w:p>

</xml_diff>